<commit_message>
Deploy simternship build 2026-10-07
</commit_message>
<xml_diff>
--- a/hub/files/PA3.5.docx
+++ b/hub/files/PA3.5.docx
@@ -28,13 +28,11 @@
           <w:p>
             <w:r>
               <w:rPr>
-                <w:b/>
                 <w:sz w:val="19"/>
               </w:rPr>
             </w:r>
             <w:r>
               <w:rPr>
-                <w:b/>
                 <w:sz w:val="19"/>
               </w:rPr>
               <w:t>Points</w:t>
@@ -48,13 +46,11 @@
           <w:p>
             <w:r>
               <w:rPr>
-                <w:b/>
                 <w:sz w:val="19"/>
               </w:rPr>
             </w:r>
             <w:r>
               <w:rPr>
-                <w:b/>
                 <w:sz w:val="19"/>
               </w:rPr>
               <w:t>4 (term project — graded on the /100 rubric below, scaled to 4 pts)</w:t>
@@ -146,7 +142,7 @@
               <w:rPr>
                 <w:sz w:val="19"/>
               </w:rPr>
-              <w:t>Team — every member recruits one participant</w:t>
+              <w:t>Team — at least 3 qualified outside participants attend (share the recruiting across members)</w:t>
             </w:r>
           </w:p>
         </w:tc>
@@ -297,10 +293,10 @@
         <w:rPr>
           <w:b/>
         </w:rPr>
-        <w:t>Recruit — one participant per member, starting Mon Sep 14.</w:t>
+        <w:t>Recruit, starting Mon Sep 14.</w:t>
       </w:r>
       <w:r>
-        <w:t xml:space="preserve"> Don't wait for the Week-5 brief: other people's calendars are the bottleneck, so line up your person the week of Sep 14 and hold a slot for Sep 24–27. Each of you invites one </w:t>
+        <w:t xml:space="preserve"> Don't wait for the Week-5 brief: other people's calendars are the bottleneck, so line up participants the week of Sep 14 and hold a slot for Sep 24–27. Aim for each of you to invite one </w:t>
       </w:r>
       <w:r>
         <w:rPr>
@@ -309,7 +305,7 @@
         <w:t>qualified</w:t>
       </w:r>
       <w:r>
-        <w:t xml:space="preserve"> friend or family member. Qualified = (homeowner, </w:t>
+        <w:t xml:space="preserve"> friend or family member; full credit needs at least 3 qualified participants attending, whoever recruited them. Qualified = (homeowner, </w:t>
       </w:r>
       <w:r>
         <w:rPr>
@@ -657,7 +653,7 @@
               <w:rPr>
                 <w:sz w:val="19"/>
               </w:rPr>
-              <w:t>One participant per member, each screener row complete; participants genuinely fit the Neo target — not "my roommate said yes"</w:t>
+              <w:t>At least 3 qualified participants attend; each screener row complete; participants genuinely fit the Neo target — not "my roommate said yes"</w:t>
             </w:r>
           </w:p>
         </w:tc>
@@ -1107,6 +1103,376 @@
           </w:p>
         </w:tc>
       </w:tr>
+      <w:tr>
+        <w:tc>
+          <w:tcPr>
+            <w:tcW w:type="dxa" w:w="2352"/>
+          </w:tcPr>
+          <w:p>
+            <w:r>
+              <w:rPr>
+                <w:sz w:val="18"/>
+              </w:rPr>
+            </w:r>
+          </w:p>
+        </w:tc>
+        <w:tc>
+          <w:tcPr>
+            <w:tcW w:type="dxa" w:w="2352"/>
+          </w:tcPr>
+          <w:p>
+            <w:r>
+              <w:rPr>
+                <w:sz w:val="18"/>
+              </w:rPr>
+            </w:r>
+          </w:p>
+        </w:tc>
+        <w:tc>
+          <w:tcPr>
+            <w:tcW w:type="dxa" w:w="2352"/>
+          </w:tcPr>
+          <w:p>
+            <w:r>
+              <w:rPr>
+                <w:sz w:val="18"/>
+              </w:rPr>
+            </w:r>
+          </w:p>
+        </w:tc>
+        <w:tc>
+          <w:tcPr>
+            <w:tcW w:type="dxa" w:w="2352"/>
+          </w:tcPr>
+          <w:p>
+            <w:r>
+              <w:rPr>
+                <w:sz w:val="18"/>
+              </w:rPr>
+            </w:r>
+          </w:p>
+        </w:tc>
+        <w:tc>
+          <w:tcPr>
+            <w:tcW w:type="dxa" w:w="2352"/>
+          </w:tcPr>
+          <w:p>
+            <w:r>
+              <w:rPr>
+                <w:sz w:val="18"/>
+              </w:rPr>
+            </w:r>
+          </w:p>
+        </w:tc>
+        <w:tc>
+          <w:tcPr>
+            <w:tcW w:type="dxa" w:w="2352"/>
+          </w:tcPr>
+          <w:p>
+            <w:r>
+              <w:rPr>
+                <w:sz w:val="18"/>
+              </w:rPr>
+            </w:r>
+          </w:p>
+        </w:tc>
+      </w:tr>
+      <w:tr>
+        <w:tc>
+          <w:tcPr>
+            <w:tcW w:type="dxa" w:w="2352"/>
+          </w:tcPr>
+          <w:p>
+            <w:r>
+              <w:rPr>
+                <w:sz w:val="18"/>
+              </w:rPr>
+            </w:r>
+          </w:p>
+        </w:tc>
+        <w:tc>
+          <w:tcPr>
+            <w:tcW w:type="dxa" w:w="2352"/>
+          </w:tcPr>
+          <w:p>
+            <w:r>
+              <w:rPr>
+                <w:sz w:val="18"/>
+              </w:rPr>
+            </w:r>
+          </w:p>
+        </w:tc>
+        <w:tc>
+          <w:tcPr>
+            <w:tcW w:type="dxa" w:w="2352"/>
+          </w:tcPr>
+          <w:p>
+            <w:r>
+              <w:rPr>
+                <w:sz w:val="18"/>
+              </w:rPr>
+            </w:r>
+          </w:p>
+        </w:tc>
+        <w:tc>
+          <w:tcPr>
+            <w:tcW w:type="dxa" w:w="2352"/>
+          </w:tcPr>
+          <w:p>
+            <w:r>
+              <w:rPr>
+                <w:sz w:val="18"/>
+              </w:rPr>
+            </w:r>
+          </w:p>
+        </w:tc>
+        <w:tc>
+          <w:tcPr>
+            <w:tcW w:type="dxa" w:w="2352"/>
+          </w:tcPr>
+          <w:p>
+            <w:r>
+              <w:rPr>
+                <w:sz w:val="18"/>
+              </w:rPr>
+            </w:r>
+          </w:p>
+        </w:tc>
+        <w:tc>
+          <w:tcPr>
+            <w:tcW w:type="dxa" w:w="2352"/>
+          </w:tcPr>
+          <w:p>
+            <w:r>
+              <w:rPr>
+                <w:sz w:val="18"/>
+              </w:rPr>
+            </w:r>
+          </w:p>
+        </w:tc>
+      </w:tr>
+      <w:tr>
+        <w:tc>
+          <w:tcPr>
+            <w:tcW w:type="dxa" w:w="2352"/>
+          </w:tcPr>
+          <w:p>
+            <w:r>
+              <w:rPr>
+                <w:sz w:val="18"/>
+              </w:rPr>
+            </w:r>
+          </w:p>
+        </w:tc>
+        <w:tc>
+          <w:tcPr>
+            <w:tcW w:type="dxa" w:w="2352"/>
+          </w:tcPr>
+          <w:p>
+            <w:r>
+              <w:rPr>
+                <w:sz w:val="18"/>
+              </w:rPr>
+            </w:r>
+          </w:p>
+        </w:tc>
+        <w:tc>
+          <w:tcPr>
+            <w:tcW w:type="dxa" w:w="2352"/>
+          </w:tcPr>
+          <w:p>
+            <w:r>
+              <w:rPr>
+                <w:sz w:val="18"/>
+              </w:rPr>
+            </w:r>
+          </w:p>
+        </w:tc>
+        <w:tc>
+          <w:tcPr>
+            <w:tcW w:type="dxa" w:w="2352"/>
+          </w:tcPr>
+          <w:p>
+            <w:r>
+              <w:rPr>
+                <w:sz w:val="18"/>
+              </w:rPr>
+            </w:r>
+          </w:p>
+        </w:tc>
+        <w:tc>
+          <w:tcPr>
+            <w:tcW w:type="dxa" w:w="2352"/>
+          </w:tcPr>
+          <w:p>
+            <w:r>
+              <w:rPr>
+                <w:sz w:val="18"/>
+              </w:rPr>
+            </w:r>
+          </w:p>
+        </w:tc>
+        <w:tc>
+          <w:tcPr>
+            <w:tcW w:type="dxa" w:w="2352"/>
+          </w:tcPr>
+          <w:p>
+            <w:r>
+              <w:rPr>
+                <w:sz w:val="18"/>
+              </w:rPr>
+            </w:r>
+          </w:p>
+        </w:tc>
+      </w:tr>
+      <w:tr>
+        <w:tc>
+          <w:tcPr>
+            <w:tcW w:type="dxa" w:w="2352"/>
+          </w:tcPr>
+          <w:p>
+            <w:r>
+              <w:rPr>
+                <w:sz w:val="18"/>
+              </w:rPr>
+            </w:r>
+          </w:p>
+        </w:tc>
+        <w:tc>
+          <w:tcPr>
+            <w:tcW w:type="dxa" w:w="2352"/>
+          </w:tcPr>
+          <w:p>
+            <w:r>
+              <w:rPr>
+                <w:sz w:val="18"/>
+              </w:rPr>
+            </w:r>
+          </w:p>
+        </w:tc>
+        <w:tc>
+          <w:tcPr>
+            <w:tcW w:type="dxa" w:w="2352"/>
+          </w:tcPr>
+          <w:p>
+            <w:r>
+              <w:rPr>
+                <w:sz w:val="18"/>
+              </w:rPr>
+            </w:r>
+          </w:p>
+        </w:tc>
+        <w:tc>
+          <w:tcPr>
+            <w:tcW w:type="dxa" w:w="2352"/>
+          </w:tcPr>
+          <w:p>
+            <w:r>
+              <w:rPr>
+                <w:sz w:val="18"/>
+              </w:rPr>
+            </w:r>
+          </w:p>
+        </w:tc>
+        <w:tc>
+          <w:tcPr>
+            <w:tcW w:type="dxa" w:w="2352"/>
+          </w:tcPr>
+          <w:p>
+            <w:r>
+              <w:rPr>
+                <w:sz w:val="18"/>
+              </w:rPr>
+            </w:r>
+          </w:p>
+        </w:tc>
+        <w:tc>
+          <w:tcPr>
+            <w:tcW w:type="dxa" w:w="2352"/>
+          </w:tcPr>
+          <w:p>
+            <w:r>
+              <w:rPr>
+                <w:sz w:val="18"/>
+              </w:rPr>
+            </w:r>
+          </w:p>
+        </w:tc>
+      </w:tr>
+      <w:tr>
+        <w:tc>
+          <w:tcPr>
+            <w:tcW w:type="dxa" w:w="2352"/>
+          </w:tcPr>
+          <w:p>
+            <w:r>
+              <w:rPr>
+                <w:sz w:val="18"/>
+              </w:rPr>
+            </w:r>
+          </w:p>
+        </w:tc>
+        <w:tc>
+          <w:tcPr>
+            <w:tcW w:type="dxa" w:w="2352"/>
+          </w:tcPr>
+          <w:p>
+            <w:r>
+              <w:rPr>
+                <w:sz w:val="18"/>
+              </w:rPr>
+            </w:r>
+          </w:p>
+        </w:tc>
+        <w:tc>
+          <w:tcPr>
+            <w:tcW w:type="dxa" w:w="2352"/>
+          </w:tcPr>
+          <w:p>
+            <w:r>
+              <w:rPr>
+                <w:sz w:val="18"/>
+              </w:rPr>
+            </w:r>
+          </w:p>
+        </w:tc>
+        <w:tc>
+          <w:tcPr>
+            <w:tcW w:type="dxa" w:w="2352"/>
+          </w:tcPr>
+          <w:p>
+            <w:r>
+              <w:rPr>
+                <w:sz w:val="18"/>
+              </w:rPr>
+            </w:r>
+          </w:p>
+        </w:tc>
+        <w:tc>
+          <w:tcPr>
+            <w:tcW w:type="dxa" w:w="2352"/>
+          </w:tcPr>
+          <w:p>
+            <w:r>
+              <w:rPr>
+                <w:sz w:val="18"/>
+              </w:rPr>
+            </w:r>
+          </w:p>
+        </w:tc>
+        <w:tc>
+          <w:tcPr>
+            <w:tcW w:type="dxa" w:w="2352"/>
+          </w:tcPr>
+          <w:p>
+            <w:r>
+              <w:rPr>
+                <w:sz w:val="18"/>
+              </w:rPr>
+            </w:r>
+          </w:p>
+        </w:tc>
+      </w:tr>
     </w:tbl>
     <w:p/>
     <w:p>

</xml_diff>